<commit_message>
Opleiding: nagekeken en kleine correcties
Weekdagen en data per centrum nagekeken tegen fiche, overzicht en deck; zakkaart tegen eCRF 01. Leuven inhaal vr 22 jan VM ook in het overzicht; optie B staat op de fiche van het centrum; SEBIA 3 tot 6 zijn nog voorstellen; vraag aan Gent en Leuven naar het beste moment verduidelijkt.

Co-Authored-By: Claude Opus 5.5 <noreply@anthropic.com>
</commit_message>
<xml_diff>
--- a/Educatie/Opleiding per centrum/PARADISE_opleiding_Gent.docx
+++ b/Educatie/Opleiding per centrum/PARADISE_opleiding_Gent.docx
@@ -1247,7 +1247,7 @@
           <w:color w:val="1B2630"/>
           <w:sz w:val="18"/>
         </w:rPr>
-        <w:t>U kiest op de fiche; de data van SEBIA 3 tot 6 zijn voorstellen van Fabienne Dobbels, die de SEBIA-opleiding geeft.</w:t>
+        <w:t>U kiest op de fiche. De data van SEBIA 3 tot 6 zijn nog voorstellen; SEBIA geeft Fabienne Dobbels.</w:t>
       </w:r>
     </w:p>
     <w:p>
@@ -2349,7 +2349,7 @@
           <w:color w:val="1B2630"/>
           <w:sz w:val="18"/>
         </w:rPr>
-        <w:t>–  Wat is het beste moment voor een training?</w:t>
+        <w:t>–  Wat is in uw centrum het beste moment (dag en dagdeel) voor een training, bijvoorbeeld SEBIA 5?</w:t>
       </w:r>
     </w:p>
     <w:p>

</xml_diff>